<commit_message>
Subo el lab de Arrays terminado
</commit_message>
<xml_diff>
--- a/SD-04-ArraysLab-Individual/SD-04 - Lab_ Manipulación de Arrays_Ale Carvajal.docx
+++ b/SD-04-ArraysLab-Individual/SD-04 - Lab_ Manipulación de Arrays_Ale Carvajal.docx
@@ -787,6 +787,13 @@
             </w:pPr>
             <w:r>
               <w:rPr>
+                <w:color w:val="ff0000"/>
+                <w:rtl w:val="0"/>
+              </w:rPr>
+              <w:t xml:space="preserve">Sí se realizó</w:t>
+            </w:r>
+            <w:r>
+              <w:rPr>
                 <w:rtl w:val="0"/>
               </w:rPr>
             </w:r>
@@ -830,6 +837,13 @@
             </w:pPr>
             <w:r>
               <w:rPr>
+                <w:color w:val="ff0000"/>
+                <w:rtl w:val="0"/>
+              </w:rPr>
+              <w:t xml:space="preserve">Sí se realizó</w:t>
+            </w:r>
+            <w:r>
+              <w:rPr>
                 <w:rtl w:val="0"/>
               </w:rPr>
             </w:r>
@@ -876,6 +890,13 @@
             </w:pPr>
             <w:r>
               <w:rPr>
+                <w:color w:val="ff0000"/>
+                <w:rtl w:val="0"/>
+              </w:rPr>
+              <w:t xml:space="preserve">Sí se realizó</w:t>
+            </w:r>
+            <w:r>
+              <w:rPr>
                 <w:rtl w:val="0"/>
               </w:rPr>
             </w:r>
@@ -920,6 +941,13 @@
                 <w:bCs w:val="1"/>
               </w:rPr>
             </w:pPr>
+            <w:r>
+              <w:rPr>
+                <w:color w:val="ff0000"/>
+                <w:rtl w:val="0"/>
+              </w:rPr>
+              <w:t xml:space="preserve">Sí se realizó</w:t>
+            </w:r>
             <w:r>
               <w:rPr>
                 <w:rtl w:val="0"/>
@@ -1036,6 +1064,13 @@
             </w:pPr>
             <w:r>
               <w:rPr>
+                <w:color w:val="ff0000"/>
+                <w:rtl w:val="0"/>
+              </w:rPr>
+              <w:t xml:space="preserve">Sí se realizó</w:t>
+            </w:r>
+            <w:r>
+              <w:rPr>
                 <w:rtl w:val="0"/>
               </w:rPr>
             </w:r>
@@ -1088,6 +1123,13 @@
                 <w:bCs w:val="1"/>
               </w:rPr>
             </w:pPr>
+            <w:r>
+              <w:rPr>
+                <w:color w:val="ff0000"/>
+                <w:rtl w:val="0"/>
+              </w:rPr>
+              <w:t xml:space="preserve">Sí se realizó</w:t>
+            </w:r>
             <w:r>
               <w:rPr>
                 <w:rtl w:val="0"/>
@@ -1156,6 +1198,18 @@
               </w:rPr>
               <w:t xml:space="preserve">¿Puede agregar un solo número a una fila existente?</w:t>
             </w:r>
+            <w:r>
+              <w:rPr>
+                <w:color w:val="ff0000"/>
+                <w:rtl w:val="0"/>
+              </w:rPr>
+              <w:t xml:space="preserve">Sí se realizó</w:t>
+            </w:r>
+            <w:r>
+              <w:rPr>
+                <w:rtl w:val="0"/>
+              </w:rPr>
+            </w:r>
           </w:p>
           <w:p>
             <w:pPr>
@@ -1172,6 +1226,18 @@
               </w:rPr>
               <w:t xml:space="preserve">¿Puede agregar una fila completamente nueva de números?</w:t>
             </w:r>
+            <w:r>
+              <w:rPr>
+                <w:color w:val="ff0000"/>
+                <w:rtl w:val="0"/>
+              </w:rPr>
+              <w:t xml:space="preserve">Sí se realizó</w:t>
+            </w:r>
+            <w:r>
+              <w:rPr>
+                <w:rtl w:val="0"/>
+              </w:rPr>
+            </w:r>
           </w:p>
           <w:p>
             <w:pPr>
@@ -1188,6 +1254,18 @@
               </w:rPr>
               <w:t xml:space="preserve">¿Puede eliminar un solo número de una sola fila?</w:t>
             </w:r>
+            <w:r>
+              <w:rPr>
+                <w:color w:val="ff0000"/>
+                <w:rtl w:val="0"/>
+              </w:rPr>
+              <w:t xml:space="preserve">Sí se realizó</w:t>
+            </w:r>
+            <w:r>
+              <w:rPr>
+                <w:rtl w:val="0"/>
+              </w:rPr>
+            </w:r>
           </w:p>
           <w:p>
             <w:pPr>
@@ -1203,6 +1281,18 @@
                 <w:rtl w:val="0"/>
               </w:rPr>
               <w:t xml:space="preserve">¿Puede invertir una de las filas sin afectar a las demás?</w:t>
+            </w:r>
+            <w:r>
+              <w:rPr>
+                <w:color w:val="ff0000"/>
+                <w:rtl w:val="0"/>
+              </w:rPr>
+              <w:t xml:space="preserve">Sí se realizó</w:t>
+            </w:r>
+            <w:r>
+              <w:rPr>
+                <w:rtl w:val="0"/>
+              </w:rPr>
             </w:r>
           </w:p>
           <w:p>
@@ -2426,6 +2516,20 @@
       <w:szCs w:val="52"/>
     </w:rPr>
   </w:style>
+  <w:style w:type="table" w:styleId="TableNormal" w:default="1">
+    <w:name w:val="TableNormal"/>
+    <w:tblPr>
+      <w:tblCellMar>
+        <w:top w:w="100.0" w:type="dxa"/>
+        <w:left w:w="100.0" w:type="dxa"/>
+        <w:bottom w:w="100.0" w:type="dxa"/>
+        <w:right w:w="100.0" w:type="dxa"/>
+      </w:tblCellMar>
+    </w:tblPr>
+  </w:style>
+  <w:style w:type="paragraph" w:styleId="Normal" w:default="1">
+    <w:name w:val="normal"/>
+  </w:style>
   <w:style w:type="paragraph" w:styleId="Normal" w:default="1">
     <w:name w:val="normal"/>
   </w:style>
@@ -2522,6 +2626,20 @@
       </w:tblCellMar>
     </w:tblPr>
   </w:style>
+  <w:style w:type="table" w:styleId="Table1">
+    <w:basedOn w:val="TableNormal"/>
+    <w:tblPr>
+      <w:tblStyleRowBandSize w:val="1"/>
+      <w:tblStyleColBandSize w:val="1"/>
+    </w:tblPr>
+  </w:style>
+  <w:style w:type="table" w:styleId="Table2">
+    <w:basedOn w:val="TableNormal"/>
+    <w:tblPr>
+      <w:tblStyleRowBandSize w:val="1"/>
+      <w:tblStyleColBandSize w:val="1"/>
+    </w:tblPr>
+  </w:style>
   <w:style w:type="paragraph" w:styleId="Subtitle">
     <w:name w:val="Subtitle"/>
     <w:basedOn w:val="Normal"/>
@@ -2542,6 +2660,12 @@
     <w:tblPr>
       <w:tblStyleRowBandSize w:val="1"/>
       <w:tblStyleColBandSize w:val="1"/>
+      <w:tblCellMar>
+        <w:top w:w="0.0" w:type="dxa"/>
+        <w:left w:w="0.0" w:type="dxa"/>
+        <w:bottom w:w="0.0" w:type="dxa"/>
+        <w:right w:w="0.0" w:type="dxa"/>
+      </w:tblCellMar>
     </w:tblPr>
   </w:style>
   <w:style w:type="table" w:styleId="Table2">
@@ -2549,6 +2673,12 @@
     <w:tblPr>
       <w:tblStyleRowBandSize w:val="1"/>
       <w:tblStyleColBandSize w:val="1"/>
+      <w:tblCellMar>
+        <w:top w:w="0.0" w:type="dxa"/>
+        <w:left w:w="0.0" w:type="dxa"/>
+        <w:bottom w:w="0.0" w:type="dxa"/>
+        <w:right w:w="0.0" w:type="dxa"/>
+      </w:tblCellMar>
     </w:tblPr>
   </w:style>
 </w:styles>
@@ -2876,7 +3006,7 @@
 
 <file path=customXML/item1.xml><?xml version="1.0" encoding="utf-8"?>
 <go:gDocsCustomXmlDataStorage xmlns:go="http://customooxmlschemas.google.com/" xmlns:r="http://schemas.openxmlformats.org/officeDocument/2006/relationships" uri="GoogleDocsCustomDataVersion2">
-  <go:docsCustomData xmlns:go="http://customooxmlschemas.google.com/" roundtripDataSignature="AMtx7miqJW0FIUvL6Xn0ycM//EYGin2FDQ==">CgMxLjA4AHIhMUdkUUNYWkk5U3g3TmdueGltYmkyR280ZmZPUnQzZkRT</go:docsCustomData>
+  <go:docsCustomData xmlns:go="http://customooxmlschemas.google.com/" roundtripDataSignature="AMtx7mij8eCgnfRaswCIpqrrcE2aa8isYQ==">CgMxLjA4AHIhMW1FblhPVnVLazBvS0ZmQ1Fla2ktZTNTZ0xfdDMwVnhY</go:docsCustomData>
 </go:gDocsCustomXmlDataStorage>
 </file>
 

</xml_diff>